<commit_message>
Synchronize Round 10 figures and supplementary release
</commit_message>
<xml_diff>
--- a/tables/supplementary/Supplementary_Information.docx
+++ b/tables/supplementary/Supplementary_Information.docx
@@ -8,6 +8,12 @@
         <w:jc w:val="center"/>
       </w:pPr>
       <w:r>
+        <w:rPr>
+          <w:rFonts w:ascii="Times New Roman" w:hAnsi="Times New Roman"/>
+          <w:b/>
+          <w:color w:val="17365D"/>
+          <w:sz w:val="38"/>
+        </w:rPr>
         <w:t>A non-APOE Alzheimer disease-cholesterol locus converges on TSPAN14 splice choice</w:t>
       </w:r>
     </w:p>
@@ -18,7 +24,7 @@
       </w:pPr>
       <w:r>
         <w:rPr>
-          <w:rFonts w:ascii="Arial" w:hAnsi="Arial"/>
+          <w:rFonts w:ascii="Times New Roman" w:hAnsi="Times New Roman"/>
           <w:b/>
           <w:sz w:val="30"/>
         </w:rPr>
@@ -70,7 +76,7 @@
         <w:spacing w:after="100" w:line="259" w:lineRule="auto"/>
       </w:pPr>
       <w:r>
-        <w:t>The supplementary analyses were organized around a prespecified evidence sequence: genome-wide Alzheimer disease (AD)-lipid sharing, sensitivity to the extended apolipoprotein E (APOE) region, non-APOE regional prioritization, resolution of the TSPAN14 molecular phenotype, exact-event cross-tissue consistency, local causal-scope analyses, cell-context interpretation and transcript-to-protein annotation. Genetic association, molecular quantitative-trait-locus (QTL), disease-state RNA and perturbation evidence were analyzed as distinct evidence classes and were combined only after allele, genome-build and molecular-event harmonization.</w:t>
+        <w:t>The supplementary analyses were organized around a prespecified evidence sequence: genome-wide Alzheimer disease (AD)-lipid sharing, sensitivity to the extended apolipoprotein E (APOE) region, non-APOE regional prioritization, resolution of the TSPAN14 molecular phenotype, exact-event cross-tissue consistency, local causal-scope analyses, cell-context interpretation and transcript-to-protein annotation. Genetic association, molecular quantitative-trait-locus (QTL), disease-state RNA and perturbation evidence were analysed as distinct evidence classes and were combined only after allele, genome-build and molecular-event harmonization.</w:t>
       </w:r>
     </w:p>
     <w:p>
@@ -126,7 +132,7 @@
         <w:spacing w:after="100" w:line="259" w:lineRule="auto"/>
       </w:pPr>
       <w:r>
-        <w:t>A complementary physical-window analysis removed variants in progressively broader regions around the APOE anchor, extending to 5 Mb. Concordance between LD-conditioned estimates and the extreme 5-Mb exclusion was used to evaluate whether the AD-HDL-C correlation was entirely attributable to the dominant APOE neighborhood. The physical-window result was not interpreted as a formal conditional estimate.</w:t>
+        <w:t>A complementary physical-window analysis removed variants in progressively broader regions around the APOE anchor, extending to 5 Mb. Concordance between LD-conditioned estimates and the extreme 5-Mb exclusion was used to evaluate whether the AD-HDL-C correlation was entirely attributable to the dominant APOE neighbourhood. The physical-window result was not interpreted as a formal conditional estimate.</w:t>
       </w:r>
     </w:p>
     <w:p>
@@ -158,7 +164,7 @@
         <w:pStyle w:val="Heading2"/>
       </w:pPr>
       <w:r>
-        <w:t>Canonical–cryptic acceptor count modeling</w:t>
+        <w:t>Canonical–cryptic acceptor count modelling</w:t>
       </w:r>
     </w:p>
     <w:p>
@@ -174,7 +180,7 @@
         <w:spacing w:after="100" w:line="259" w:lineRule="auto"/>
       </w:pPr>
       <w:r>
-        <w:t>A beta-binomial model related cryptic reads to total canonical-plus-cryptic reads and accommodated extra-binomial dispersion. Because no cryptic reads were detected among the 106 C/C donors, donor-level detection was additionally analyzed with Firth penalized logistic regression. Profile-likelihood confidence intervals and penalized likelihood-ratio P values were reported. A second Firth model adjusted for standardized log local-cluster depth; progressively stricter depth thresholds and leave-one-donor-out analyses tested robustness to sparse competing-junction counts.</w:t>
+        <w:t>A beta-binomial model related cryptic reads to total canonical-plus-cryptic reads and accommodated extra-binomial dispersion. Because no cryptic reads were detected among the 106 C/C donors, donor-level detection was additionally analysed with Firth penalized logistic regression. Profile-likelihood confidence intervals and penalized likelihood-ratio P values were reported. A second Firth model adjusted for standardized log local-cluster depth; progressively stricter depth thresholds and leave-one-donor-out analyses tested robustness to sparse competing-junction counts.</w:t>
       </w:r>
     </w:p>
     <w:p>
@@ -441,7 +447,7 @@
         <w:t>Supplementary Figure S2 |</w:t>
       </w:r>
       <w:r>
-        <w:t xml:space="preserve"> Complete non-APOE regional screen. A, Posterior-evidence matrix for all screened locus-trait pairs; point size and color encode the posterior probability of a shared association (PP.H4). B, Ranked regional PP.H4 values, with the TSPAN14 locus distinguished from other screened regions and the 0.80 reference threshold shown by the vertical dashed line.</w:t>
+        <w:t xml:space="preserve"> Complete non-APOE regional screen. A, Posterior-evidence matrix for all screened locus-trait pairs; point size and colour encode the posterior probability of a shared association (PP.H4). B, Ranked regional PP.H4 values, with the TSPAN14 locus distinguished from other screened regions and the 0.80 reference threshold shown by the vertical dashed line.</w:t>
       </w:r>
     </w:p>
     <w:p>
@@ -501,7 +507,7 @@
         <w:t>Supplementary Figure S3 |</w:t>
       </w:r>
       <w:r>
-        <w:t xml:space="preserve"> Colocalization and fine-mapping diagnostics at TSPAN14. A, Trait-specific posterior inclusion probabilities for the 15 highest-ranked variants. B, Sizes and top posterior inclusion probabilities of SuSiE credible sets. C, Default-prior colocalization posterior probabilities for the exact exon5-6 event with AD and cholesterol traits; the axis is restricted to the high-posterior range to resolve differences among models.</w:t>
+        <w:t xml:space="preserve"> Colocalization and fine-mapping diagnostics at TSPAN14. A, Trait-specific posterior inclusion probabilities for the 15 highest-ranked variants. B, Sizes and top posterior inclusion probabilities of SuSiE credible sets. C, Default-prior colocalization posterior probabilities for the exact exon5-6 event with AD and cholesterol traits; the axis is restricted to the high-posterior range to resolve differences among models. Conservative-prior sensitivity is reported in Supplementary Table S4.</w:t>
       </w:r>
     </w:p>
     <w:p>
@@ -817,7 +823,7 @@
       <w:r>
         <w:drawing>
           <wp:inline xmlns:a="http://schemas.openxmlformats.org/drawingml/2006/main" xmlns:pic="http://schemas.openxmlformats.org/drawingml/2006/picture">
-            <wp:extent cx="6080760" cy="5050886"/>
+            <wp:extent cx="6080760" cy="5454994"/>
             <wp:docPr id="9" name="Picture 9"/>
             <wp:cNvGraphicFramePr>
               <a:graphicFrameLocks noChangeAspect="1"/>
@@ -838,7 +844,7 @@
                   <pic:spPr>
                     <a:xfrm>
                       <a:off x="0" y="0"/>
-                      <a:ext cx="6080760" cy="5050886"/>
+                      <a:ext cx="6080760" cy="5454994"/>
                     </a:xfrm>
                     <a:prstGeom prst="rect"/>
                   </pic:spPr>
@@ -861,7 +867,7 @@
         <w:t>Supplementary Figure S9 |</w:t>
       </w:r>
       <w:r>
-        <w:t xml:space="preserve"> Cell context, disease-state RNA and structural localization. A, Evidence matrix separating exact splice QTL, total-expression QTL, disease-state and perturbation observations across neural contexts. B, Selected disease-state estimates from single-nucleus meta-analysis and adjusted SEA-AD pseudobulk analyses; intervals are shown where available. C, AlphaFold reference-model confidence across the TSPAN14 large extracellular region, with the exact amino-acid 150/151 boundary marked.</w:t>
+        <w:t xml:space="preserve"> Cell context, disease-state RNA and structural localization. A, Evidence matrix separating exact splice QTL, total-expression QTL, disease-state and perturbation observations across neural contexts. B, Selected disease-state estimates from single-nucleus meta-analysis and adjusted SEA-AD pseudobulk analyses; intervals are shown where available, and none passed a 5% false-discovery-rate threshold. C, AlphaFold reference-model confidence across the TSPAN14 large extracellular region, with the exact amino-acid 150/151 boundary marked.</w:t>
       </w:r>
     </w:p>
     <w:p>
@@ -1544,8 +1550,8 @@
     <w:qFormat/>
     <w:rsid w:val="00FC693F"/>
     <w:rPr>
-      <w:rFonts w:ascii="Arial" w:hAnsi="Arial"/>
-      <w:sz w:val="19"/>
+      <w:rFonts w:ascii="Times New Roman" w:hAnsi="Times New Roman"/>
+      <w:sz w:val="20"/>
     </w:rPr>
   </w:style>
   <w:style w:type="paragraph" w:styleId="Header">
@@ -1607,7 +1613,7 @@
       <w:outlineLvl w:val="0"/>
     </w:pPr>
     <w:rPr>
-      <w:rFonts w:asciiTheme="majorHAnsi" w:eastAsiaTheme="majorEastAsia" w:hAnsiTheme="majorHAnsi" w:cstheme="majorBidi" w:ascii="Arial" w:hAnsi="Arial"/>
+      <w:rFonts w:asciiTheme="majorHAnsi" w:eastAsiaTheme="majorEastAsia" w:hAnsiTheme="majorHAnsi" w:cstheme="majorBidi" w:ascii="Times New Roman" w:hAnsi="Times New Roman"/>
       <w:b/>
       <w:bCs/>
       <w:color w:val="17365D"/>
@@ -1631,7 +1637,7 @@
       <w:outlineLvl w:val="1"/>
     </w:pPr>
     <w:rPr>
-      <w:rFonts w:asciiTheme="majorHAnsi" w:eastAsiaTheme="majorEastAsia" w:hAnsiTheme="majorHAnsi" w:cstheme="majorBidi" w:ascii="Arial" w:hAnsi="Arial"/>
+      <w:rFonts w:asciiTheme="majorHAnsi" w:eastAsiaTheme="majorEastAsia" w:hAnsiTheme="majorHAnsi" w:cstheme="majorBidi" w:ascii="Times New Roman" w:hAnsi="Times New Roman"/>
       <w:b/>
       <w:bCs/>
       <w:color w:val="17365D"/>

</xml_diff>